<commit_message>
Update: briefings/Briefing Final - Cliente.docx
</commit_message>
<xml_diff>
--- a/briefings/Briefing Final - Cliente.docx
+++ b/briefings/Briefing Final - Cliente.docx
@@ -20,7 +20,7 @@
           <w:i/>
           <w:iCs/>
         </w:rPr>
-        <w:t xml:space="preserve">Data de envio: 19/11/2025, 14:29:28</w:t>
+        <w:t xml:space="preserve">Data de envio: 12/06/2026, 12:36:49</w:t>
       </w:r>
     </w:p>
     <w:p>
@@ -45,7 +45,7 @@
       </w:r>
       <w:r>
         <w:br/>
-        <w:t xml:space="preserve"> Maglietta</w:t>
+        <w:t xml:space="preserve"> UP Estofados Fitness</w:t>
       </w:r>
     </w:p>
     <w:p>
@@ -61,7 +61,7 @@
       </w:r>
       <w:r>
         <w:br/>
-        <w:t xml:space="preserve"> Não</w:t>
+        <w:t xml:space="preserve"> Não informado</w:t>
       </w:r>
     </w:p>
     <w:p>
@@ -77,8 +77,9 @@
       </w:r>
       <w:r>
         <w:br/>
-        <w:t xml:space="preserve"> Maglietta — Confecção especializada em malharia e fitness.
-Atendemos pessoas, marcas e empresas que buscam uniformes, peças para eventos, viagens, aniversários ou private label, sempre com alto padrão de qualidade. Desenvolvemos produtos exclusivos, personalizados com seu logo ou estampa, utilizando materiais premium e acabamentos diferenciados — garantindo identidade, conforto e excelência em cada detalhe.</w:t>
+        <w:t xml:space="preserve"> Empresa especializada em fabricação de estofados para equipamentos fitness. Produzimos estofados sob medida para aparelhos de musculação, bancos, equipamentos de pilates, macas de fisioterapia e projetos especiais. Atendendo fabricantes, assistências técnicas, academias, condomínios, studio de pilates e centros esportivos em todo o Brasil.
+Trabalhamos com materiais de alta resistência, espumas de qualidade e acabamento profissional, garantindo conforto, durabilidade e excelente apresentação para os equipamentos. Oferecemos diversas opções de cores, medidas e personalizações para atender às necessidades de cada cliente.
+Nosso compromisso é fornecer estofados de alto padrão, com produção ágil, qualidade consistente e atendimento especializado para o mercado fitness.</w:t>
       </w:r>
     </w:p>
     <w:p>
@@ -94,7 +95,7 @@
       </w:r>
       <w:r>
         <w:br/>
-        <w:t xml:space="preserve"> 17.540.180/0001-05</w:t>
+        <w:t xml:space="preserve"> 55.226.319/0001-21</w:t>
       </w:r>
     </w:p>
     <w:p>
@@ -110,7 +111,7 @@
       </w:r>
       <w:r>
         <w:br/>
-        <w:t xml:space="preserve"> Confecção Personalizada</w:t>
+        <w:t xml:space="preserve"> Fabricante de estofados</w:t>
       </w:r>
     </w:p>
     <w:p>
@@ -135,8 +136,7 @@
       </w:r>
       <w:r>
         <w:br/>
-        <w:t xml:space="preserve"> R. Pedregulhos, 48 - Chácara da Barra
-Campinas - SP, 13090-716</w:t>
+        <w:t xml:space="preserve"> RUA PEDRO DIOGO, 117. PARQUE RESIDENCIAL VILA UNIAO. CAMPINAS-SP. 13060-719</w:t>
       </w:r>
     </w:p>
     <w:p>
@@ -152,7 +152,7 @@
       </w:r>
       <w:r>
         <w:br/>
-        <w:t xml:space="preserve"> Loja física (cliente vai até você)</w:t>
+        <w:t xml:space="preserve"> Online/Virtual</w:t>
       </w:r>
     </w:p>
     <w:p>
@@ -184,7 +184,8 @@
       </w:r>
       <w:r>
         <w:br/>
-        <w:t xml:space="preserve"> Todo o Brasil</w:t>
+        <w:t xml:space="preserve"> Regiões aonde conseguimos fazer a instalação dos estofados: Grande Campinas e São Paulo Capital.
+Regiões que conseguimos enviar o produto e o cliente fica responsável pela instalação: Brasil inteiro.</w:t>
       </w:r>
     </w:p>
     <w:p>
@@ -232,7 +233,7 @@
       </w:r>
       <w:r>
         <w:br/>
-        <w:t xml:space="preserve"> Segunda a Sexta, das 8h às 18h</w:t>
+        <w:t xml:space="preserve"> Segunda a Sexta: 8h às 17h.</w:t>
       </w:r>
     </w:p>
     <w:p>
@@ -248,7 +249,7 @@
       </w:r>
       <w:r>
         <w:br/>
-        <w:t xml:space="preserve"> Nao</w:t>
+        <w:t xml:space="preserve"> Não informado</w:t>
       </w:r>
     </w:p>
     <w:p>
@@ -273,7 +274,7 @@
       </w:r>
       <w:r>
         <w:br/>
-        <w:t xml:space="preserve"> Em 2016</w:t>
+        <w:t xml:space="preserve"> A empresa foi criada em 2024. Os sócios trabalhavam juntos em uma outra empresa do mesmo ramo, saímos dessa empresa e resolvemos montar o próprio negócio.</w:t>
       </w:r>
     </w:p>
     <w:p>
@@ -289,7 +290,7 @@
       </w:r>
       <w:r>
         <w:br/>
-        <w:t xml:space="preserve"> 11 anos</w:t>
+        <w:t xml:space="preserve"> mais de 12 anos</w:t>
       </w:r>
     </w:p>
     <w:p>
@@ -305,7 +306,7 @@
       </w:r>
       <w:r>
         <w:br/>
-        <w:t xml:space="preserve"> nao</w:t>
+        <w:t xml:space="preserve"> não</w:t>
       </w:r>
     </w:p>
     <w:p>
@@ -321,7 +322,7 @@
       </w:r>
       <w:r>
         <w:br/>
-        <w:t xml:space="preserve"> nao</w:t>
+        <w:t xml:space="preserve"> não</w:t>
       </w:r>
     </w:p>
     <w:p>
@@ -337,7 +338,7 @@
       </w:r>
       <w:r>
         <w:br/>
-        <w:t xml:space="preserve"> Mais de 1000</w:t>
+        <w:t xml:space="preserve"> 100-500</w:t>
       </w:r>
     </w:p>
     <w:p>
@@ -362,20 +363,7 @@
       </w:r>
       <w:r>
         <w:br/>
-        <w:t xml:space="preserve"> Camiseta em diversos tecidos: 100% algodão sustentável com certificado BCI, dry 100% poliamida com proteção UV, dry 100% poliéster com proteção UV, PV Anti-pilling, Modal, Tech Modal
-Polo em piquet
-Moletom flanelado 2 e 3 cabos
-Avental em oxford
-Corta vento
-Bermuda Masculina
-Calça unissex
-Legging
-Top
-Bermuda Feminina
-Saia Fitness
-Bolsas
-Brindes
-Ecobags</w:t>
+        <w:t xml:space="preserve"> Fabricação de estofados para equipamentos fitness: aparelhos de musculação, bancos de academia, equipamentos de pilates, estofados personalizados, macas de fisioterapia</w:t>
       </w:r>
     </w:p>
     <w:p>
@@ -391,7 +379,7 @@
       </w:r>
       <w:r>
         <w:br/>
-        <w:t xml:space="preserve"> Nosso carro chefe são as camisetas em malha 100% algodão e 100% poliamida.</w:t>
+        <w:t xml:space="preserve"> estofados para equipamentos fitness</w:t>
       </w:r>
     </w:p>
     <w:p>
@@ -407,7 +395,7 @@
       </w:r>
       <w:r>
         <w:br/>
-        <w:t xml:space="preserve"> Não</w:t>
+        <w:t xml:space="preserve"> não</w:t>
       </w:r>
     </w:p>
     <w:p>
@@ -423,7 +411,7 @@
       </w:r>
       <w:r>
         <w:br/>
-        <w:t xml:space="preserve"> Trabalhamos com matéria prima e acabamentos premium para uma peça bacana e com durabilidade. Além de trabalharmos com algumas peças já em estoque produzidas, para conseguir atender mais rápido o cliente e apenas estampar. Conseguimos fazer entrega expressa.</w:t>
+        <w:t xml:space="preserve"> Experiência de atender grandes redes de academia como Smart Fit, Panobianco e SkyFit, portanto é um produto que a qualidade já foi testada e validada em academias com um grande volume de alunos. Agilidade no atendimento, atendimento padronizado.</w:t>
       </w:r>
     </w:p>
     <w:p>
@@ -439,7 +427,7 @@
       </w:r>
       <w:r>
         <w:br/>
-        <w:t xml:space="preserve"> Marca própria</w:t>
+        <w:t xml:space="preserve"> Life Fitness, Technogym, Matrix, Movement, Kikos, CImerian, MetaLife Pilates, etc</w:t>
       </w:r>
     </w:p>
     <w:p>
@@ -455,7 +443,7 @@
       </w:r>
       <w:r>
         <w:br/>
-        <w:t xml:space="preserve"> Médio</w:t>
+        <w:t xml:space="preserve"> Variado</w:t>
       </w:r>
     </w:p>
     <w:p>
@@ -471,7 +459,7 @@
       </w:r>
       <w:r>
         <w:br/>
-        <w:t xml:space="preserve"> Não informado</w:t>
+        <w:t xml:space="preserve"> sim, 90 dias de garantia</w:t>
       </w:r>
     </w:p>
     <w:p>
@@ -496,7 +484,7 @@
       </w:r>
       <w:r>
         <w:br/>
-        <w:t xml:space="preserve"> Whastapp 19997958700</w:t>
+        <w:t xml:space="preserve"> Redes sociais e WhatsApp</w:t>
       </w:r>
     </w:p>
     <w:p>
@@ -512,7 +500,7 @@
       </w:r>
       <w:r>
         <w:br/>
-        <w:t xml:space="preserve"> Whastapp</w:t>
+        <w:t xml:space="preserve"> WhatsApp</w:t>
       </w:r>
     </w:p>
     <w:p>
@@ -544,7 +532,7 @@
       </w:r>
       <w:r>
         <w:br/>
-        <w:t xml:space="preserve"> Pix e cartão de crédito (taxas extras)</w:t>
+        <w:t xml:space="preserve"> Pix, boleto, cartão de crédito com taxa da bandeira.</w:t>
       </w:r>
     </w:p>
     <w:p>
@@ -560,7 +548,7 @@
       </w:r>
       <w:r>
         <w:br/>
-        <w:t xml:space="preserve"> Não</w:t>
+        <w:t xml:space="preserve"> negociável</w:t>
       </w:r>
     </w:p>
     <w:p>
@@ -576,7 +564,7 @@
       </w:r>
       <w:r>
         <w:br/>
-        <w:t xml:space="preserve"> Conseguimos entregar super rápido o que já temos em estoque, porém se é alguma cor ou material que trabalhamos sob demanda, o prazo máximo é de até 30 dias (geralmente entregamos em 20), mas deixamos uma folga para épocas com muitos pedidos / eventuais contratempos.</w:t>
+        <w:t xml:space="preserve"> até 10 dias</w:t>
       </w:r>
     </w:p>
     <w:p>
@@ -617,10 +605,23 @@
       </w:r>
       <w:r>
         <w:br/>
-        <w:t xml:space="preserve"> Camiseta em Campinas
-Camiseta personalizada
-Uniforme
-Camiseta com qualidade</w:t>
+        <w:t xml:space="preserve"> Estofados para academia
+Estofados para equipamentos fitness
+Estofados para aparelhos de musculação
+Fabricante de estofados para academia
+Fornecedor de estofados para academia
+Estofados sob medida para equipamentos fitness
+Assentos para aparelhos de musculação
+Encostos para equipamentos de academia
+Estofados para leg press
+Estofados para cadeira extensora
+Estofados para cadeira flexora
+Estofados para supino
+Estofados para equipamentos de pilates
+Estofado Reformer
+Estofado Step Chair
+Estofado Barrel
+Estofado Cadillac</w:t>
       </w:r>
     </w:p>
     <w:p>
@@ -636,15 +637,23 @@
       </w:r>
       <w:r>
         <w:br/>
-        <w:t xml:space="preserve"> Camiseta
-Moletom
-Uniforme premium
-Camiseta de algodão
-Camiseta fitness
-Camiseta sem pedido minimo
-Uniforme para academia
-Uniforme de qualidade
-Camiseta para viagem</w:t>
+        <w:t xml:space="preserve"> Estofados para academia
+Estofados para equipamentos fitness
+Estofados para aparelhos de musculação
+Fabricante de estofados para academia
+Fornecedor de estofados para academia
+Estofados sob medida para equipamentos fitness
+Assentos para aparelhos de musculação
+Encostos para equipamentos de academia
+Estofados para leg press
+Estofados para cadeira extensora
+Estofados para cadeira flexora
+Estofados para supino
+Estofados para equipamentos de pilates
+Estofado Reformer
+Estofado Step Chair
+Estofado Barrel
+Estofado Cadillac</w:t>
       </w:r>
     </w:p>
     <w:p>
@@ -660,7 +669,7 @@
       </w:r>
       <w:r>
         <w:br/>
-        <w:t xml:space="preserve"> Camiseta promocional</w:t>
+        <w:t xml:space="preserve"> Não informado</w:t>
       </w:r>
     </w:p>
     <w:p>
@@ -701,10 +710,9 @@
       </w:r>
       <w:r>
         <w:br/>
-        <w:t xml:space="preserve"> Kan House
-Espeta
-Articulania
-FG Confecacao
+        <w:t xml:space="preserve"> Remate Plasticos - Valinhos - SP
+Stuff Tech - Rio de Janeiro - RJ
+AT Fit - São Paulo - SP
 </w:t>
       </w:r>
     </w:p>
@@ -721,8 +729,7 @@
       </w:r>
       <w:r>
         <w:br/>
-        <w:t xml:space="preserve"> Com excessao da FG, a qualidade.
-FG as camisetas são de qualidade inferior</w:t>
+        <w:t xml:space="preserve"> estrutura de produção</w:t>
       </w:r>
     </w:p>
     <w:p>
@@ -738,7 +745,7 @@
       </w:r>
       <w:r>
         <w:br/>
-        <w:t xml:space="preserve"> Entrega expressa e qualidade</w:t>
+        <w:t xml:space="preserve"> agilidade no atendimento de ponta a ponta</w:t>
       </w:r>
     </w:p>
     <w:p>
@@ -754,7 +761,9 @@
       </w:r>
       <w:r>
         <w:br/>
-        <w:t xml:space="preserve"> Kan House</w:t>
+        <w:t xml:space="preserve"> @rrestofadosfitness
+@fastestofadosgym
+</w:t>
       </w:r>
     </w:p>
     <w:p>
@@ -770,7 +779,9 @@
       </w:r>
       <w:r>
         <w:br/>
-        <w:t xml:space="preserve"> Não informado</w:t>
+        <w:t xml:space="preserve"> Remate Plasticos - Valinhos - SP
+Stuff Tech - Rio de Janeiro - RJ
+AT Fit - São Paulo - SP</w:t>
       </w:r>
     </w:p>
     <w:p>
@@ -795,7 +806,7 @@
       </w:r>
       <w:r>
         <w:br/>
-        <w:t xml:space="preserve"> Logo profissional completo</w:t>
+        <w:t xml:space="preserve"> Logo básico</w:t>
       </w:r>
     </w:p>
     <w:p>
@@ -811,7 +822,7 @@
       </w:r>
       <w:r>
         <w:br/>
-        <w:t xml:space="preserve"> Produtos</w:t>
+        <w:t xml:space="preserve"> Produto, clientes, antes e depois</w:t>
       </w:r>
     </w:p>
     <w:p>
@@ -827,7 +838,7 @@
       </w:r>
       <w:r>
         <w:br/>
-        <w:t xml:space="preserve"> Não</w:t>
+        <w:t xml:space="preserve"> Sim</w:t>
       </w:r>
     </w:p>
     <w:p>
@@ -868,8 +879,7 @@
       </w:r>
       <w:r>
         <w:br/>
-        <w:t xml:space="preserve"> @maglietta_oficial
-FB: magliettaoficial</w:t>
+        <w:t xml:space="preserve"> up.estofados</w:t>
       </w:r>
     </w:p>
     <w:p>
@@ -885,7 +895,7 @@
       </w:r>
       <w:r>
         <w:br/>
-        <w:t xml:space="preserve"> Nao</w:t>
+        <w:t xml:space="preserve"> não</w:t>
       </w:r>
     </w:p>
     <w:p>
@@ -901,7 +911,7 @@
       </w:r>
       <w:r>
         <w:br/>
-        <w:t xml:space="preserve"> -</w:t>
+        <w:t xml:space="preserve"> Não informado</w:t>
       </w:r>
     </w:p>
     <w:p>
@@ -917,7 +927,7 @@
       </w:r>
       <w:r>
         <w:br/>
-        <w:t xml:space="preserve"> Não</w:t>
+        <w:t xml:space="preserve"> Pretende fazer</w:t>
       </w:r>
     </w:p>
     <w:p>
@@ -958,7 +968,7 @@
       </w:r>
       <w:r>
         <w:br/>
-        <w:t xml:space="preserve"> Estacionamento, Wi-Fi, aceita pets</w:t>
+        <w:t xml:space="preserve"> no momento nao recebemos publico </w:t>
       </w:r>
     </w:p>
     <w:p>
@@ -974,7 +984,7 @@
       </w:r>
       <w:r>
         <w:br/>
-        <w:t xml:space="preserve"> Amplo</w:t>
+        <w:t xml:space="preserve"> Não informado</w:t>
       </w:r>
     </w:p>
     <w:p>
@@ -1063,7 +1073,7 @@
       </w:r>
       <w:r>
         <w:br/>
-        <w:t xml:space="preserve"> Não</w:t>
+        <w:t xml:space="preserve"> Sim</w:t>
       </w:r>
     </w:p>
     <w:p>
@@ -1120,7 +1130,7 @@
       </w:r>
       <w:r>
         <w:br/>
-        <w:t xml:space="preserve"> Talvez</w:t>
+        <w:t xml:space="preserve"> Sim</w:t>
       </w:r>
     </w:p>
     <w:p>
@@ -1145,7 +1155,7 @@
       </w:r>
       <w:r>
         <w:br/>
-        <w:t xml:space="preserve"> Rafaela 19997958700</w:t>
+        <w:t xml:space="preserve"> Rodrigo, sócio.</w:t>
       </w:r>
     </w:p>
     <w:p>
@@ -1218,7 +1228,7 @@
       </w:r>
       <w:r>
         <w:br/>
-        <w:t xml:space="preserve"> nao</w:t>
+        <w:t xml:space="preserve"> Não informado</w:t>
       </w:r>
     </w:p>
     <w:p>
@@ -1234,7 +1244,7 @@
       </w:r>
       <w:r>
         <w:br/>
-        <w:t xml:space="preserve"> nao</w:t>
+        <w:t xml:space="preserve"> Não informado</w:t>
       </w:r>
     </w:p>
     <w:p>
@@ -1250,7 +1260,7 @@
       </w:r>
       <w:r>
         <w:br/>
-        <w:t xml:space="preserve"> nao</w:t>
+        <w:t xml:space="preserve"> Não informado</w:t>
       </w:r>
     </w:p>
     <w:p>
@@ -1291,7 +1301,7 @@
       </w:r>
       <w:r>
         <w:br/>
-        <w:t xml:space="preserve"> nao</w:t>
+        <w:t xml:space="preserve"> Não informado</w:t>
       </w:r>
     </w:p>
     <w:p>
@@ -1307,7 +1317,7 @@
       </w:r>
       <w:r>
         <w:br/>
-        <w:t xml:space="preserve"> Melhorar a visibilidade online e aumento de vendas</w:t>
+        <w:t xml:space="preserve"> aumentar número de vendas.</w:t>
       </w:r>
     </w:p>
     <w:p>
@@ -1339,7 +1349,7 @@
       </w:r>
       <w:r>
         <w:br/>
-        <w:t xml:space="preserve"> Produção completa</w:t>
+        <w:t xml:space="preserve"> Não informado</w:t>
       </w:r>
     </w:p>
     <w:p>

</xml_diff>